<commit_message>
Redesign print trim: framed letterpress border, page-anchored corners
The corner art was positioned with a tab stop in the header paragraph, but
the built-in Header style carries its own centre tab and Word merges style
tabs with direct formatting — so the tab landed on the centre stop and pulled
the right-hand art toward the middle instead of the corner.

Replaced with a single page-sized transparent ornament anchored to the page
at offset (0,0), behindDoc, so placement cannot be perturbed by margins,
paragraph styles or inherited tabs. Verified symmetric to the pixel.

Design is now a double rule that breaks at each corner with an olive sprig
bridging the break, rather than four loose sprigs. Stroke widths are whole
multiples of the supersample factor and downsample by area average, so the
hairlines keep full ink density instead of antialiasing to a washed-out grey.

Co-Authored-By: Claude Opus 5 (1M context) <noreply@anthropic.com>
</commit_message>
<xml_diff>
--- a/print/favours.docx
+++ b/print/favours.docx
@@ -136,9 +136,8 @@
     </w:p>
     <w:sectPr>
       <w:headerReference w:type="default" r:id="rId9"/>
-      <w:footerReference w:type="default" r:id="rId10"/>
       <w:pgSz w:w="11906" w:h="16838"/>
-      <w:pgMar w:top="1587" w:right="1587" w:bottom="1587" w:left="1587" w:header="510" w:footer="510" w:gutter="0"/>
+      <w:pgMar w:top="1814" w:right="1814" w:bottom="1814" w:left="1814" w:header="510" w:footer="510" w:gutter="0"/>
       <w:cols w:space="720"/>
       <w:docGrid w:linePitch="360"/>
       <w:vAlign w:val="center"/>
@@ -147,26 +146,33 @@
 </w:document>
 </file>
 
-<file path=word/footer1.xml><?xml version="1.0" encoding="utf-8"?>
-<w:ftr xmlns:m="http://schemas.openxmlformats.org/officeDocument/2006/math" xmlns:mc="http://schemas.openxmlformats.org/markup-compatibility/2006" xmlns:mo="http://schemas.microsoft.com/office/mac/office/2008/main" xmlns:mv="urn:schemas-microsoft-com:mac:vml" xmlns:o="urn:schemas-microsoft-com:office:office" xmlns:r="http://schemas.openxmlformats.org/officeDocument/2006/relationships" xmlns:v="urn:schemas-microsoft-com:vml" xmlns:w10="urn:schemas-microsoft-com:office:word" xmlns:w14="http://schemas.microsoft.com/office/word/2010/wordml" xmlns:w="http://schemas.openxmlformats.org/wordprocessingml/2006/main" xmlns:wne="http://schemas.microsoft.com/office/word/2006/wordml" xmlns:wp14="http://schemas.microsoft.com/office/word/2010/wordprocessingDrawing" xmlns:wp="http://schemas.openxmlformats.org/drawingml/2006/wordprocessingDrawing" xmlns:wpc="http://schemas.microsoft.com/office/word/2010/wordprocessingCanvas" xmlns:wpg="http://schemas.microsoft.com/office/word/2010/wordprocessingGroup" xmlns:wpi="http://schemas.microsoft.com/office/word/2010/wordprocessingInk" xmlns:wps="http://schemas.microsoft.com/office/word/2010/wordprocessingShape" mc:Ignorable="w14 wp14">
+<file path=word/header1.xml><?xml version="1.0" encoding="utf-8"?>
+<w:hdr xmlns:m="http://schemas.openxmlformats.org/officeDocument/2006/math" xmlns:mc="http://schemas.openxmlformats.org/markup-compatibility/2006" xmlns:mo="http://schemas.microsoft.com/office/mac/office/2008/main" xmlns:mv="urn:schemas-microsoft-com:mac:vml" xmlns:o="urn:schemas-microsoft-com:office:office" xmlns:r="http://schemas.openxmlformats.org/officeDocument/2006/relationships" xmlns:v="urn:schemas-microsoft-com:vml" xmlns:w10="urn:schemas-microsoft-com:office:word" xmlns:w14="http://schemas.microsoft.com/office/word/2010/wordml" xmlns:w="http://schemas.openxmlformats.org/wordprocessingml/2006/main" xmlns:wne="http://schemas.microsoft.com/office/word/2006/wordml" xmlns:wp14="http://schemas.microsoft.com/office/word/2010/wordprocessingDrawing" xmlns:wp="http://schemas.openxmlformats.org/drawingml/2006/wordprocessingDrawing" xmlns:wpc="http://schemas.microsoft.com/office/word/2010/wordprocessingCanvas" xmlns:wpg="http://schemas.microsoft.com/office/word/2010/wordprocessingGroup" xmlns:wpi="http://schemas.microsoft.com/office/word/2010/wordprocessingInk" xmlns:wps="http://schemas.microsoft.com/office/word/2010/wordprocessingShape" mc:Ignorable="w14 wp14">
   <w:p>
     <w:pPr>
-      <w:pStyle w:val="Footer"/>
-      <w:tabs>
-        <w:tab w:pos="8732" w:val="right"/>
-      </w:tabs>
-      <w:spacing w:before="0" w:after="0"/>
+      <w:pStyle w:val="Header"/>
+      <w:spacing w:before="0" w:after="0" w:line="20" w:lineRule="exact"/>
       <w:jc w:val="left"/>
     </w:pPr>
     <w:r>
+      <w:rPr>
+        <w:sz w:val="2"/>
+      </w:rPr>
       <w:drawing>
-        <wp:inline xmlns:a="http://schemas.openxmlformats.org/drawingml/2006/main" xmlns:pic="http://schemas.openxmlformats.org/drawingml/2006/picture">
-          <wp:extent cx="640080" cy="640080"/>
-          <wp:docPr id="1" name="Picture 1"/>
-          <wp:cNvGraphicFramePr>
-            <a:graphicFrameLocks noChangeAspect="1"/>
-          </wp:cNvGraphicFramePr>
-          <a:graphic>
+        <wp:anchor distT="0" distB="0" distL="0" distR="0" simplePos="0" relativeHeight="0" behindDoc="1" locked="0" layoutInCell="1" allowOverlap="1">
+          <wp:simplePos x="0" y="0"/>
+          <wp:positionH relativeFrom="page">
+            <wp:posOffset>0</wp:posOffset>
+          </wp:positionH>
+          <wp:positionV relativeFrom="page">
+            <wp:posOffset>0</wp:posOffset>
+          </wp:positionV>
+          <wp:extent cx="7560310" cy="10692130"/>
+          <wp:effectExtent l="0" t="0" r="0" b="0"/>
+          <wp:wrapNone/>
+          <wp:docPr id="31" name="Trim 31"/>
+          <wp:cNvGraphicFramePr/>
+          <a:graphic xmlns:a="http://schemas.openxmlformats.org/drawingml/2006/main" xmlns:pic="http://schemas.openxmlformats.org/drawingml/2006/picture">
             <a:graphicData uri="http://schemas.openxmlformats.org/drawingml/2006/picture">
               <pic:pic>
                 <pic:nvPicPr>
@@ -182,137 +188,14 @@
                 <pic:spPr>
                   <a:xfrm>
                     <a:off x="0" y="0"/>
-                    <a:ext cx="640080" cy="640080"/>
+                    <a:ext cx="7560310" cy="10692130"/>
                   </a:xfrm>
                   <a:prstGeom prst="rect"/>
                 </pic:spPr>
               </pic:pic>
             </a:graphicData>
           </a:graphic>
-        </wp:inline>
-      </w:drawing>
-    </w:r>
-    <w:r>
-      <w:tab/>
-    </w:r>
-    <w:r>
-      <w:drawing>
-        <wp:inline xmlns:a="http://schemas.openxmlformats.org/drawingml/2006/main" xmlns:pic="http://schemas.openxmlformats.org/drawingml/2006/picture">
-          <wp:extent cx="640080" cy="640080"/>
-          <wp:docPr id="2" name="Picture 2"/>
-          <wp:cNvGraphicFramePr>
-            <a:graphicFrameLocks noChangeAspect="1"/>
-          </wp:cNvGraphicFramePr>
-          <a:graphic>
-            <a:graphicData uri="http://schemas.openxmlformats.org/drawingml/2006/picture">
-              <pic:pic>
-                <pic:nvPicPr>
-                  <pic:cNvPr id="0" name="image.png"/>
-                  <pic:cNvPicPr/>
-                </pic:nvPicPr>
-                <pic:blipFill>
-                  <a:blip r:embed="rId2"/>
-                  <a:stretch>
-                    <a:fillRect/>
-                  </a:stretch>
-                </pic:blipFill>
-                <pic:spPr>
-                  <a:xfrm>
-                    <a:off x="0" y="0"/>
-                    <a:ext cx="640080" cy="640080"/>
-                  </a:xfrm>
-                  <a:prstGeom prst="rect"/>
-                </pic:spPr>
-              </pic:pic>
-            </a:graphicData>
-          </a:graphic>
-        </wp:inline>
-      </w:drawing>
-    </w:r>
-  </w:p>
-</w:ftr>
-</file>
-
-<file path=word/header1.xml><?xml version="1.0" encoding="utf-8"?>
-<w:hdr xmlns:m="http://schemas.openxmlformats.org/officeDocument/2006/math" xmlns:mc="http://schemas.openxmlformats.org/markup-compatibility/2006" xmlns:mo="http://schemas.microsoft.com/office/mac/office/2008/main" xmlns:mv="urn:schemas-microsoft-com:mac:vml" xmlns:o="urn:schemas-microsoft-com:office:office" xmlns:r="http://schemas.openxmlformats.org/officeDocument/2006/relationships" xmlns:v="urn:schemas-microsoft-com:vml" xmlns:w10="urn:schemas-microsoft-com:office:word" xmlns:w14="http://schemas.microsoft.com/office/word/2010/wordml" xmlns:w="http://schemas.openxmlformats.org/wordprocessingml/2006/main" xmlns:wne="http://schemas.microsoft.com/office/word/2006/wordml" xmlns:wp14="http://schemas.microsoft.com/office/word/2010/wordprocessingDrawing" xmlns:wp="http://schemas.openxmlformats.org/drawingml/2006/wordprocessingDrawing" xmlns:wpc="http://schemas.microsoft.com/office/word/2010/wordprocessingCanvas" xmlns:wpg="http://schemas.microsoft.com/office/word/2010/wordprocessingGroup" xmlns:wpi="http://schemas.microsoft.com/office/word/2010/wordprocessingInk" xmlns:wps="http://schemas.microsoft.com/office/word/2010/wordprocessingShape" mc:Ignorable="w14 wp14">
-  <w:p>
-    <w:pPr>
-      <w:pStyle w:val="Header"/>
-      <w:tabs>
-        <w:tab w:pos="8732" w:val="right"/>
-      </w:tabs>
-      <w:spacing w:before="0" w:after="0"/>
-      <w:jc w:val="left"/>
-    </w:pPr>
-    <w:r>
-      <w:drawing>
-        <wp:inline xmlns:a="http://schemas.openxmlformats.org/drawingml/2006/main" xmlns:pic="http://schemas.openxmlformats.org/drawingml/2006/picture">
-          <wp:extent cx="640080" cy="640080"/>
-          <wp:docPr id="1" name="Picture 1"/>
-          <wp:cNvGraphicFramePr>
-            <a:graphicFrameLocks noChangeAspect="1"/>
-          </wp:cNvGraphicFramePr>
-          <a:graphic>
-            <a:graphicData uri="http://schemas.openxmlformats.org/drawingml/2006/picture">
-              <pic:pic>
-                <pic:nvPicPr>
-                  <pic:cNvPr id="0" name="image.png"/>
-                  <pic:cNvPicPr/>
-                </pic:nvPicPr>
-                <pic:blipFill>
-                  <a:blip r:embed="rId1"/>
-                  <a:stretch>
-                    <a:fillRect/>
-                  </a:stretch>
-                </pic:blipFill>
-                <pic:spPr>
-                  <a:xfrm>
-                    <a:off x="0" y="0"/>
-                    <a:ext cx="640080" cy="640080"/>
-                  </a:xfrm>
-                  <a:prstGeom prst="rect"/>
-                </pic:spPr>
-              </pic:pic>
-            </a:graphicData>
-          </a:graphic>
-        </wp:inline>
-      </w:drawing>
-    </w:r>
-    <w:r>
-      <w:tab/>
-    </w:r>
-    <w:r>
-      <w:drawing>
-        <wp:inline xmlns:a="http://schemas.openxmlformats.org/drawingml/2006/main" xmlns:pic="http://schemas.openxmlformats.org/drawingml/2006/picture">
-          <wp:extent cx="640080" cy="640080"/>
-          <wp:docPr id="2" name="Picture 2"/>
-          <wp:cNvGraphicFramePr>
-            <a:graphicFrameLocks noChangeAspect="1"/>
-          </wp:cNvGraphicFramePr>
-          <a:graphic>
-            <a:graphicData uri="http://schemas.openxmlformats.org/drawingml/2006/picture">
-              <pic:pic>
-                <pic:nvPicPr>
-                  <pic:cNvPr id="0" name="image.png"/>
-                  <pic:cNvPicPr/>
-                </pic:nvPicPr>
-                <pic:blipFill>
-                  <a:blip r:embed="rId2"/>
-                  <a:stretch>
-                    <a:fillRect/>
-                  </a:stretch>
-                </pic:blipFill>
-                <pic:spPr>
-                  <a:xfrm>
-                    <a:off x="0" y="0"/>
-                    <a:ext cx="640080" cy="640080"/>
-                  </a:xfrm>
-                  <a:prstGeom prst="rect"/>
-                </pic:spPr>
-              </pic:pic>
-            </a:graphicData>
-          </a:graphic>
-        </wp:inline>
+        </wp:anchor>
       </w:drawing>
     </w:r>
   </w:p>

</xml_diff>

<commit_message>
Give the trimmed cards bleed, so a wobbly cut still looks right
You were right that the line sat too close to the flowers - measured, the
leaf tips touched it: 0.00mm at the top, 0.32mm on the left. Cutting a
millimetre inside would have clipped the leaves; a millimetre outside would
have left a white sliver down that edge.

The artwork is now drawn 4mm larger than the trim on every side, with the cut
line inside it rather than on its edge. Anywhere within 4mm of the line still
lands on foliage, so the finished card has colour running to all four edges
whichever way the scissors wander.

4mm rather than the printer's usual 3, because this is being cut by hand.

Verified from the generator: the line trims to exactly 130.0 x 180.0 and
180.0 x 130.0mm.

Co-Authored-By: Claude Opus 5 (1M context) <noreply@anthropic.com>
</commit_message>
<xml_diff>
--- a/print/favours.docx
+++ b/print/favours.docx
@@ -130,12 +130,12 @@
         <wp:anchor distT="0" distB="0" distL="0" distR="0" simplePos="0" relativeHeight="0" behindDoc="1" locked="0" layoutInCell="1" allowOverlap="1">
           <wp:simplePos x="0" y="0"/>
           <wp:positionH relativeFrom="page">
-            <wp:posOffset>324142</wp:posOffset>
+            <wp:posOffset>180142</wp:posOffset>
           </wp:positionH>
           <wp:positionV relativeFrom="page">
-            <wp:posOffset>540155</wp:posOffset>
+            <wp:posOffset>396155</wp:posOffset>
           </wp:positionV>
-          <wp:extent cx="4680000" cy="6480000"/>
+          <wp:extent cx="4968000" cy="6768000"/>
           <wp:effectExtent l="0" t="0" r="0" b="0"/>
           <wp:wrapNone/>
           <wp:docPr id="31" name="Trim 31"/>
@@ -156,7 +156,7 @@
                 <pic:spPr>
                   <a:xfrm>
                     <a:off x="0" y="0"/>
-                    <a:ext cx="4680000" cy="6480000"/>
+                    <a:ext cx="4968000" cy="6768000"/>
                   </a:xfrm>
                   <a:prstGeom prst="rect"/>
                 </pic:spPr>

</xml_diff>